<commit_message>
Solicitud Humanos y Glosario Finanzas
</commit_message>
<xml_diff>
--- a/wwwroot/templates/sprfm.docx
+++ b/wwwroot/templates/sprfm.docx
@@ -862,9 +862,8 @@
                 <w:b/>
                 <w:szCs w:val="24"/>
               </w:rPr>
-              <w:t xml:space="preserve">Alta  </w:t>
-            </w:r>
-            <w:proofErr w:type="gramStart"/>
+              <w:t>Alta</w:t>
+            </w:r>
             <w:r>
               <w:rPr>
                 <w:rFonts w:ascii="Arial" w:hAnsi="Arial" w:cs="Arial"/>
@@ -876,6 +875,7 @@
             <w:r>
               <w:rPr>
                 <w:rFonts w:ascii="Arial" w:hAnsi="Arial" w:cs="Arial"/>
+                <w:b/>
                 <w:szCs w:val="24"/>
               </w:rPr>
               <w:t xml:space="preserve"> </w:t>
@@ -887,7 +887,6 @@
               </w:rPr>
               <w:t>{</w:t>
             </w:r>
-            <w:proofErr w:type="gramEnd"/>
             <w:r>
               <w:rPr>
                 <w:rFonts w:ascii="Arial" w:hAnsi="Arial" w:cs="Arial"/>
@@ -1030,8 +1029,6 @@
         <w:spacing w:after="0"/>
         <w:rPr>
           <w:rFonts w:ascii="Arial" w:hAnsi="Arial" w:cs="Arial"/>
-          <w:sz w:val="24"/>
-          <w:szCs w:val="24"/>
         </w:rPr>
       </w:pPr>
     </w:p>
@@ -2682,7 +2679,7 @@
       </w:pPr>
     </w:p>
     <w:sectPr>
-      <w:headerReference w:type="default" r:id="rId7"/>
+      <w:headerReference w:type="default" r:id="rId8"/>
       <w:pgSz w:w="12240" w:h="15840"/>
       <w:pgMar w:top="1361" w:right="1701" w:bottom="1361" w:left="1701" w:header="709" w:footer="709" w:gutter="0"/>
       <w:cols w:space="708"/>
@@ -4373,4 +4370,16 @@
     </a:ext>
   </a:extLst>
 </a:theme>
+</file>
+
+<file path=customXml/item1.xml><?xml version="1.0" encoding="utf-8"?>
+<b:Sources xmlns:b="http://schemas.openxmlformats.org/officeDocument/2006/bibliography" xmlns="http://schemas.openxmlformats.org/officeDocument/2006/bibliography" SelectedStyle="\APASixthEditionOfficeOnline.xsl" StyleName="APA" Version="6"/>
+</file>
+
+<file path=customXml/itemProps1.xml><?xml version="1.0" encoding="utf-8"?>
+<ds:datastoreItem xmlns:ds="http://schemas.openxmlformats.org/officeDocument/2006/customXml" ds:itemID="{FDEE8587-8A69-4D4A-BD6E-A811EA582DBD}">
+  <ds:schemaRefs>
+    <ds:schemaRef ds:uri="http://schemas.openxmlformats.org/officeDocument/2006/bibliography"/>
+  </ds:schemaRefs>
+</ds:datastoreItem>
 </file>
</xml_diff>

<commit_message>
Solicitudes Tabla CRUD y Login
</commit_message>
<xml_diff>
--- a/wwwroot/templates/sprfm.docx
+++ b/wwwroot/templates/sprfm.docx
@@ -1025,7 +1025,7 @@
     </w:tbl>
     <w:p>
       <w:pPr>
-        <w:spacing w:after="0"/>
+        <w:spacing w:after="0" w:line="240" w:lineRule="auto"/>
         <w:rPr>
           <w:rFonts w:ascii="Arial" w:hAnsi="Arial" w:cs="Arial"/>
         </w:rPr>
@@ -2234,7 +2234,7 @@
     </w:tbl>
     <w:p>
       <w:pPr>
-        <w:spacing w:after="0"/>
+        <w:spacing w:after="0" w:line="192" w:lineRule="auto"/>
         <w:rPr>
           <w:rFonts w:ascii="Arial" w:hAnsi="Arial" w:cs="Arial"/>
           <w:sz w:val="24"/>
@@ -2670,6 +2670,7 @@
     </w:tbl>
     <w:p>
       <w:pPr>
+        <w:spacing w:line="192" w:lineRule="auto"/>
         <w:rPr>
           <w:rFonts w:ascii="Arial" w:hAnsi="Arial" w:cs="Arial"/>
           <w:sz w:val="24"/>

</xml_diff>

<commit_message>
Actualizar Solicitud, Dependencia en Documentos y Usuario RH Adicional
</commit_message>
<xml_diff>
--- a/wwwroot/templates/sprfm.docx
+++ b/wwwroot/templates/sprfm.docx
@@ -11,9 +11,9 @@
         <w:tblLook w:val="04A0" w:firstRow="1" w:lastRow="0" w:firstColumn="1" w:lastColumn="0" w:noHBand="0" w:noVBand="1"/>
       </w:tblPr>
       <w:tblGrid>
-        <w:gridCol w:w="4416"/>
-        <w:gridCol w:w="1003"/>
-        <w:gridCol w:w="2945"/>
+        <w:gridCol w:w="3686"/>
+        <w:gridCol w:w="993"/>
+        <w:gridCol w:w="3685"/>
         <w:gridCol w:w="709"/>
         <w:gridCol w:w="709"/>
         <w:gridCol w:w="708"/>
@@ -241,7 +241,7 @@
         </w:trPr>
         <w:tc>
           <w:tcPr>
-            <w:tcW w:w="4416" w:type="dxa"/>
+            <w:tcW w:w="3686" w:type="dxa"/>
             <w:vAlign w:val="bottom"/>
           </w:tcPr>
           <w:p>
@@ -273,7 +273,7 @@
         </w:tc>
         <w:tc>
           <w:tcPr>
-            <w:tcW w:w="6074" w:type="dxa"/>
+            <w:tcW w:w="6804" w:type="dxa"/>
             <w:gridSpan w:val="5"/>
           </w:tcPr>
           <w:p>
@@ -313,7 +313,7 @@
       <w:tr>
         <w:tc>
           <w:tcPr>
-            <w:tcW w:w="4416" w:type="dxa"/>
+            <w:tcW w:w="3686" w:type="dxa"/>
             <w:vAlign w:val="bottom"/>
           </w:tcPr>
           <w:p>
@@ -345,7 +345,7 @@
         </w:tc>
         <w:tc>
           <w:tcPr>
-            <w:tcW w:w="6074" w:type="dxa"/>
+            <w:tcW w:w="6804" w:type="dxa"/>
             <w:gridSpan w:val="5"/>
           </w:tcPr>
           <w:p>
@@ -384,7 +384,7 @@
       <w:tr>
         <w:tc>
           <w:tcPr>
-            <w:tcW w:w="4416" w:type="dxa"/>
+            <w:tcW w:w="3686" w:type="dxa"/>
             <w:vAlign w:val="bottom"/>
           </w:tcPr>
           <w:p>
@@ -416,7 +416,7 @@
         </w:tc>
         <w:tc>
           <w:tcPr>
-            <w:tcW w:w="6074" w:type="dxa"/>
+            <w:tcW w:w="6804" w:type="dxa"/>
             <w:gridSpan w:val="5"/>
           </w:tcPr>
           <w:p>
@@ -456,75 +456,74 @@
       <w:tr>
         <w:tc>
           <w:tcPr>
-            <w:tcW w:w="4416" w:type="dxa"/>
-            <w:vAlign w:val="bottom"/>
+            <w:tcW w:w="3686" w:type="dxa"/>
+          </w:tcPr>
+          <w:p>
+            <w:pPr>
+              <w:spacing w:line="276" w:lineRule="auto"/>
+              <w:rPr>
+                <w:rFonts w:ascii="Arial" w:hAnsi="Arial" w:cs="Arial"/>
+                <w:b/>
+                <w:szCs w:val="24"/>
+              </w:rPr>
+            </w:pPr>
+            <w:r>
+              <w:rPr>
+                <w:rFonts w:ascii="Arial" w:hAnsi="Arial" w:cs="Arial"/>
+                <w:b/>
+                <w:szCs w:val="24"/>
+              </w:rPr>
+              <w:t>Unidad Responsable</w:t>
+            </w:r>
+            <w:r>
+              <w:rPr>
+                <w:rFonts w:ascii="Arial" w:hAnsi="Arial" w:cs="Arial"/>
+                <w:b/>
+                <w:szCs w:val="24"/>
+              </w:rPr>
+              <w:t>:</w:t>
+            </w:r>
+            <w:r>
+              <w:rPr>
+                <w:rFonts w:ascii="Arial" w:hAnsi="Arial" w:cs="Arial"/>
+                <w:b/>
+                <w:szCs w:val="24"/>
+              </w:rPr>
+              <w:br/>
+            </w:r>
+            <w:r>
+              <w:rPr>
+                <w:rFonts w:ascii="Arial" w:hAnsi="Arial" w:cs="Arial"/>
+                <w:szCs w:val="24"/>
+              </w:rPr>
+              <w:t>(</w:t>
+            </w:r>
+            <w:r>
+              <w:rPr>
+                <w:rFonts w:ascii="Arial" w:hAnsi="Arial" w:cs="Arial"/>
+                <w:i/>
+                <w:szCs w:val="24"/>
+              </w:rPr>
+              <w:t>Clave y Nombre</w:t>
+            </w:r>
+            <w:r>
+              <w:rPr>
+                <w:rFonts w:ascii="Arial" w:hAnsi="Arial" w:cs="Arial"/>
+                <w:szCs w:val="24"/>
+              </w:rPr>
+              <w:t>)</w:t>
+            </w:r>
+          </w:p>
+        </w:tc>
+        <w:tc>
+          <w:tcPr>
+            <w:tcW w:w="993" w:type="dxa"/>
           </w:tcPr>
           <w:p>
             <w:pPr>
               <w:spacing w:line="360" w:lineRule="auto"/>
               <w:rPr>
                 <w:rFonts w:ascii="Arial" w:hAnsi="Arial" w:cs="Arial"/>
-                <w:b/>
-                <w:szCs w:val="24"/>
-              </w:rPr>
-            </w:pPr>
-            <w:r>
-              <w:rPr>
-                <w:rFonts w:ascii="Arial" w:hAnsi="Arial" w:cs="Arial"/>
-                <w:b/>
-                <w:szCs w:val="24"/>
-              </w:rPr>
-              <w:t>Unidad Responsable</w:t>
-            </w:r>
-            <w:r>
-              <w:rPr>
-                <w:rFonts w:ascii="Arial" w:hAnsi="Arial" w:cs="Arial"/>
-                <w:b/>
-                <w:szCs w:val="24"/>
-              </w:rPr>
-              <w:t>:</w:t>
-            </w:r>
-            <w:r>
-              <w:rPr>
-                <w:rFonts w:ascii="Arial" w:hAnsi="Arial" w:cs="Arial"/>
-                <w:b/>
-                <w:szCs w:val="24"/>
-              </w:rPr>
-              <w:t xml:space="preserve"> </w:t>
-            </w:r>
-            <w:r>
-              <w:rPr>
-                <w:rFonts w:ascii="Arial" w:hAnsi="Arial" w:cs="Arial"/>
-                <w:szCs w:val="24"/>
-              </w:rPr>
-              <w:t>(</w:t>
-            </w:r>
-            <w:r>
-              <w:rPr>
-                <w:rFonts w:ascii="Arial" w:hAnsi="Arial" w:cs="Arial"/>
-                <w:i/>
-                <w:szCs w:val="24"/>
-              </w:rPr>
-              <w:t>Clave y Nombre</w:t>
-            </w:r>
-            <w:r>
-              <w:rPr>
-                <w:rFonts w:ascii="Arial" w:hAnsi="Arial" w:cs="Arial"/>
-                <w:szCs w:val="24"/>
-              </w:rPr>
-              <w:t>)</w:t>
-            </w:r>
-          </w:p>
-        </w:tc>
-        <w:tc>
-          <w:tcPr>
-            <w:tcW w:w="1003" w:type="dxa"/>
-          </w:tcPr>
-          <w:p>
-            <w:pPr>
-              <w:spacing w:line="360" w:lineRule="auto"/>
-              <w:rPr>
-                <w:rFonts w:ascii="Arial" w:hAnsi="Arial" w:cs="Arial"/>
                 <w:szCs w:val="24"/>
               </w:rPr>
             </w:pPr>
@@ -555,7 +554,7 @@
         </w:tc>
         <w:tc>
           <w:tcPr>
-            <w:tcW w:w="5071" w:type="dxa"/>
+            <w:tcW w:w="5811" w:type="dxa"/>
             <w:gridSpan w:val="4"/>
           </w:tcPr>
           <w:p>
@@ -594,7 +593,7 @@
       <w:tr>
         <w:tc>
           <w:tcPr>
-            <w:tcW w:w="4416" w:type="dxa"/>
+            <w:tcW w:w="3686" w:type="dxa"/>
             <w:vAlign w:val="bottom"/>
           </w:tcPr>
           <w:p>
@@ -656,7 +655,7 @@
         </w:tc>
         <w:tc>
           <w:tcPr>
-            <w:tcW w:w="1003" w:type="dxa"/>
+            <w:tcW w:w="993" w:type="dxa"/>
           </w:tcPr>
           <w:p>
             <w:pPr>
@@ -693,7 +692,7 @@
         </w:tc>
         <w:tc>
           <w:tcPr>
-            <w:tcW w:w="5071" w:type="dxa"/>
+            <w:tcW w:w="5811" w:type="dxa"/>
             <w:gridSpan w:val="4"/>
           </w:tcPr>
           <w:p>
@@ -732,7 +731,7 @@
       <w:tr>
         <w:tc>
           <w:tcPr>
-            <w:tcW w:w="4416" w:type="dxa"/>
+            <w:tcW w:w="3686" w:type="dxa"/>
             <w:vAlign w:val="bottom"/>
           </w:tcPr>
           <w:p>
@@ -764,7 +763,7 @@
         </w:tc>
         <w:tc>
           <w:tcPr>
-            <w:tcW w:w="6074" w:type="dxa"/>
+            <w:tcW w:w="6804" w:type="dxa"/>
             <w:gridSpan w:val="5"/>
           </w:tcPr>
           <w:p>
@@ -1477,7 +1476,7 @@
                 <w:rFonts w:ascii="Arial" w:hAnsi="Arial" w:cs="Arial"/>
                 <w:b/>
               </w:rPr>
-              <w:t>resP</w:t>
+              <w:t>resPr</w:t>
             </w:r>
             <w:r>
               <w:rPr>
@@ -1485,7 +1484,7 @@
                 <w:b/>
               </w:rPr>
               <w:lastRenderedPageBreak/>
-              <w:t>roy</w:t>
+              <w:t>oy</w:t>
             </w:r>
             <w:proofErr w:type="spellEnd"/>
             <w:r>
@@ -2043,15 +2042,7 @@
                 <w:rFonts w:ascii="Arial" w:hAnsi="Arial" w:cs="Arial"/>
                 <w:b/>
               </w:rPr>
-              <w:t>ur</w:t>
-            </w:r>
-            <w:r>
-              <w:rPr>
-                <w:rFonts w:ascii="Arial" w:hAnsi="Arial" w:cs="Arial"/>
-                <w:b/>
-              </w:rPr>
-              <w:lastRenderedPageBreak/>
-              <w:t>Adic</w:t>
+              <w:t>urAdic</w:t>
             </w:r>
             <w:proofErr w:type="spellEnd"/>
             <w:r>
@@ -2097,6 +2088,7 @@
               <w:rPr>
                 <w:rFonts w:ascii="Arial" w:hAnsi="Arial" w:cs="Arial"/>
               </w:rPr>
+              <w:lastRenderedPageBreak/>
               <w:t>Permiso específico</w:t>
             </w:r>
           </w:p>
@@ -2681,7 +2673,7 @@
     <w:sectPr>
       <w:headerReference w:type="default" r:id="rId8"/>
       <w:pgSz w:w="12240" w:h="15840"/>
-      <w:pgMar w:top="1361" w:right="1701" w:bottom="1361" w:left="1701" w:header="709" w:footer="709" w:gutter="0"/>
+      <w:pgMar w:top="1361" w:right="1701" w:bottom="567" w:left="1701" w:header="709" w:footer="709" w:gutter="0"/>
       <w:cols w:space="708"/>
       <w:docGrid w:linePitch="360"/>
     </w:sectPr>

</xml_diff>